<commit_message>
Minor changes in codes
1. For code optimization and data visualization.
2. Codes for EEG added.
</commit_message>
<xml_diff>
--- a/ReadMe.docx
+++ b/ReadMe.docx
@@ -142,10 +142,7 @@
         <w:t xml:space="preserve">s - </w:t>
       </w:r>
       <w:r>
-        <w:t xml:space="preserve"> </w:t>
-      </w:r>
-      <w:r>
-        <w:t>runGetDualTF_FullScreen_LFPVals_sessionWise.m</w:t>
+        <w:t xml:space="preserve"> runGetDualTF_FullScreen_LFPVals_sessionWise.m</w:t>
       </w:r>
       <w:r>
         <w:t xml:space="preserve"> and </w:t>
@@ -356,21 +353,7 @@
                 <w:sz w:val="24"/>
                 <w:szCs w:val="24"/>
               </w:rPr>
-              <w:t xml:space="preserve">FFT values for plaid stimuli for the </w:t>
-            </w:r>
-            <w:r>
-              <w:rPr>
-                <w:sz w:val="24"/>
-                <w:szCs w:val="24"/>
-              </w:rPr>
-              <w:t>baseline</w:t>
-            </w:r>
-            <w:r>
-              <w:rPr>
-                <w:sz w:val="24"/>
-                <w:szCs w:val="24"/>
-              </w:rPr>
-              <w:t xml:space="preserve"> period. </w:t>
+              <w:t xml:space="preserve">FFT values for plaid stimuli for the baseline period. </w:t>
             </w:r>
             <w:r>
               <w:rPr>
@@ -509,21 +492,7 @@
                 <w:sz w:val="24"/>
                 <w:szCs w:val="24"/>
               </w:rPr>
-              <w:t xml:space="preserve">FFT values for </w:t>
-            </w:r>
-            <w:r>
-              <w:rPr>
-                <w:sz w:val="24"/>
-                <w:szCs w:val="24"/>
-              </w:rPr>
-              <w:t>grating</w:t>
-            </w:r>
-            <w:r>
-              <w:rPr>
-                <w:sz w:val="24"/>
-                <w:szCs w:val="24"/>
-              </w:rPr>
-              <w:t xml:space="preserve"> stimuli for the analysis period. </w:t>
+              <w:t xml:space="preserve">FFT values for grating stimuli for the analysis period. </w:t>
             </w:r>
             <w:r>
               <w:rPr>
@@ -580,21 +549,7 @@
                 <w:sz w:val="24"/>
                 <w:szCs w:val="24"/>
               </w:rPr>
-              <w:t xml:space="preserve">FFT values for grating stimuli for the </w:t>
-            </w:r>
-            <w:r>
-              <w:rPr>
-                <w:sz w:val="24"/>
-                <w:szCs w:val="24"/>
-              </w:rPr>
-              <w:t>baseline</w:t>
-            </w:r>
-            <w:r>
-              <w:rPr>
-                <w:sz w:val="24"/>
-                <w:szCs w:val="24"/>
-              </w:rPr>
-              <w:t xml:space="preserve"> period. </w:t>
+              <w:t xml:space="preserve">FFT values for grating stimuli for the baseline period. </w:t>
             </w:r>
             <w:r>
               <w:rPr>
@@ -941,28 +896,7 @@
           <w:b/>
           <w:bCs/>
         </w:rPr>
-        <w:t xml:space="preserve"> </w:t>
-      </w:r>
-      <w:r>
-        <w:rPr>
-          <w:b/>
-          <w:bCs/>
-        </w:rPr>
-        <w:t xml:space="preserve">(Experiment </w:t>
-      </w:r>
-      <w:r>
-        <w:rPr>
-          <w:b/>
-          <w:bCs/>
-        </w:rPr>
-        <w:t>2</w:t>
-      </w:r>
-      <w:r>
-        <w:rPr>
-          <w:b/>
-          <w:bCs/>
-        </w:rPr>
-        <w:t>)</w:t>
+        <w:t xml:space="preserve"> (Experiment 2)</w:t>
       </w:r>
       <w:r>
         <w:t xml:space="preserve">. </w:t>
@@ -1205,14 +1139,7 @@
                 <w:sz w:val="24"/>
                 <w:szCs w:val="24"/>
               </w:rPr>
-              <w:t>Cells correspond to the number of sessions used.</w:t>
-            </w:r>
-            <w:r>
-              <w:rPr>
-                <w:sz w:val="24"/>
-                <w:szCs w:val="24"/>
-              </w:rPr>
-              <w:t xml:space="preserve"> Each cell then show</w:t>
+              <w:t>Cells correspond to the number of sessions used. Each cell then show</w:t>
             </w:r>
             <w:r>
               <w:rPr>
@@ -1226,14 +1153,7 @@
                 <w:sz w:val="24"/>
                 <w:szCs w:val="24"/>
               </w:rPr>
-              <w:t xml:space="preserve"> the stimulus parameters </w:t>
-            </w:r>
-            <w:r>
-              <w:rPr>
-                <w:sz w:val="24"/>
-                <w:szCs w:val="24"/>
-              </w:rPr>
-              <w:t>presented in that session</w:t>
+              <w:t xml:space="preserve"> the stimulus parameters presented in that session</w:t>
             </w:r>
             <w:r>
               <w:rPr>
@@ -1293,21 +1213,7 @@
                 <w:sz w:val="24"/>
                 <w:szCs w:val="24"/>
               </w:rPr>
-              <w:t xml:space="preserve">FFT values for </w:t>
-            </w:r>
-            <w:r>
-              <w:rPr>
-                <w:sz w:val="24"/>
-                <w:szCs w:val="24"/>
-              </w:rPr>
-              <w:t>plaid</w:t>
-            </w:r>
-            <w:r>
-              <w:rPr>
-                <w:sz w:val="24"/>
-                <w:szCs w:val="24"/>
-              </w:rPr>
-              <w:t xml:space="preserve"> stimuli for the analysis period. </w:t>
+              <w:t xml:space="preserve">FFT values for plaid stimuli for the analysis period. </w:t>
             </w:r>
             <w:r>
               <w:rPr>
@@ -1335,7 +1241,14 @@
                 <w:sz w:val="24"/>
                 <w:szCs w:val="24"/>
               </w:rPr>
-              <w:t>(0 to 25% on a log scale)</w:t>
+              <w:t xml:space="preserve">(0 to 25% on a log scale) </w:t>
+            </w:r>
+            <w:r>
+              <w:rPr>
+                <w:sz w:val="24"/>
+                <w:szCs w:val="24"/>
+              </w:rPr>
+              <w:t>*Mask Grating Contrast</w:t>
             </w:r>
             <w:r>
               <w:rPr>
@@ -1349,28 +1262,7 @@
                 <w:sz w:val="24"/>
                 <w:szCs w:val="24"/>
               </w:rPr>
-              <w:t>*Mask Grating Contrast</w:t>
-            </w:r>
-            <w:r>
-              <w:rPr>
-                <w:sz w:val="24"/>
-                <w:szCs w:val="24"/>
-              </w:rPr>
-              <w:t xml:space="preserve"> </w:t>
-            </w:r>
-            <w:r>
-              <w:rPr>
-                <w:sz w:val="24"/>
-                <w:szCs w:val="24"/>
-              </w:rPr>
-              <w:t>(0 to 25% on a log scale)</w:t>
-            </w:r>
-            <w:r>
-              <w:rPr>
-                <w:sz w:val="24"/>
-                <w:szCs w:val="24"/>
-              </w:rPr>
-              <w:t xml:space="preserve"> </w:t>
+              <w:t xml:space="preserve">(0 to 25% on a log scale) </w:t>
             </w:r>
             <w:r>
               <w:rPr>
@@ -1441,21 +1333,7 @@
                 <w:sz w:val="24"/>
                 <w:szCs w:val="24"/>
               </w:rPr>
-              <w:t xml:space="preserve">FFT values for plaid stimuli for the </w:t>
-            </w:r>
-            <w:r>
-              <w:rPr>
-                <w:sz w:val="24"/>
-                <w:szCs w:val="24"/>
-              </w:rPr>
-              <w:t>baseline</w:t>
-            </w:r>
-            <w:r>
-              <w:rPr>
-                <w:sz w:val="24"/>
-                <w:szCs w:val="24"/>
-              </w:rPr>
-              <w:t xml:space="preserve"> period. 6</w:t>
+              <w:t>FFT values for plaid stimuli for the baseline period. 6</w:t>
             </w:r>
             <w:r>
               <w:rPr>
@@ -1621,21 +1499,7 @@
                 <w:sz w:val="24"/>
                 <w:szCs w:val="24"/>
               </w:rPr>
-              <w:t xml:space="preserve">FFT values for </w:t>
-            </w:r>
-            <w:r>
-              <w:rPr>
-                <w:sz w:val="24"/>
-                <w:szCs w:val="24"/>
-              </w:rPr>
-              <w:t>grating</w:t>
-            </w:r>
-            <w:r>
-              <w:rPr>
-                <w:sz w:val="24"/>
-                <w:szCs w:val="24"/>
-              </w:rPr>
-              <w:t xml:space="preserve"> stimuli for the analysis period. 6</w:t>
+              <w:t>FFT values for grating stimuli for the analysis period. 6</w:t>
             </w:r>
             <w:r>
               <w:rPr>
@@ -1723,21 +1587,7 @@
                 <w:sz w:val="24"/>
                 <w:szCs w:val="24"/>
               </w:rPr>
-              <w:t xml:space="preserve">FFT values for </w:t>
-            </w:r>
-            <w:r>
-              <w:rPr>
-                <w:sz w:val="24"/>
-                <w:szCs w:val="24"/>
-              </w:rPr>
-              <w:t>grating</w:t>
-            </w:r>
-            <w:r>
-              <w:rPr>
-                <w:sz w:val="24"/>
-                <w:szCs w:val="24"/>
-              </w:rPr>
-              <w:t xml:space="preserve"> stimuli for the baseline period. 6</w:t>
+              <w:t>FFT values for grating stimuli for the baseline period. 6</w:t>
             </w:r>
             <w:r>
               <w:rPr>
@@ -1980,14 +1830,7 @@
                 <w:sz w:val="24"/>
                 <w:szCs w:val="24"/>
               </w:rPr>
-              <w:t xml:space="preserve">– irrespective of the plaid condition, it was always subtracted from grating with </w:t>
-            </w:r>
-            <w:r>
-              <w:rPr>
-                <w:sz w:val="24"/>
-                <w:szCs w:val="24"/>
-              </w:rPr>
-              <w:t>15Hz TF at 25% contrast</w:t>
+              <w:t>– irrespective of the plaid condition, it was always subtracted from grating with 15Hz TF at 25% contrast</w:t>
             </w:r>
             <w:r>
               <w:rPr>
@@ -2504,14 +2347,7 @@
                 <w:sz w:val="24"/>
                 <w:szCs w:val="24"/>
               </w:rPr>
-              <w:t>1</w:t>
-            </w:r>
-            <w:r>
-              <w:rPr>
-                <w:sz w:val="24"/>
-                <w:szCs w:val="24"/>
-              </w:rPr>
-              <w:t>-</w:t>
+              <w:t>1-</w:t>
             </w:r>
             <w:r>
               <w:rPr>
@@ -2541,49 +2377,7 @@
                 <w:sz w:val="24"/>
                 <w:szCs w:val="24"/>
               </w:rPr>
-              <w:t>(</w:t>
-            </w:r>
-            <w:r>
-              <w:rPr>
-                <w:sz w:val="24"/>
-                <w:szCs w:val="24"/>
-              </w:rPr>
-              <w:t>|</w:t>
-            </w:r>
-            <w:r>
-              <w:rPr>
-                <w:sz w:val="24"/>
-                <w:szCs w:val="24"/>
-              </w:rPr>
-              <w:t>15</w:t>
-            </w:r>
-            <w:r>
-              <w:rPr>
-                <w:sz w:val="24"/>
-                <w:szCs w:val="24"/>
-              </w:rPr>
-              <w:t>-</w:t>
-            </w:r>
-            <w:r>
-              <w:rPr>
-                <w:sz w:val="24"/>
-                <w:szCs w:val="24"/>
-              </w:rPr>
-              <w:t xml:space="preserve"> Mask temporal frequency</w:t>
-            </w:r>
-            <w:r>
-              <w:rPr>
-                <w:sz w:val="24"/>
-                <w:szCs w:val="24"/>
-              </w:rPr>
-              <w:t>|</w:t>
-            </w:r>
-            <w:r>
-              <w:rPr>
-                <w:sz w:val="24"/>
-                <w:szCs w:val="24"/>
-              </w:rPr>
-              <w:t>)</w:t>
+              <w:t>(|15- Mask temporal frequency|)</w:t>
             </w:r>
           </w:p>
         </w:tc>
@@ -2680,14 +2474,7 @@
                 <w:sz w:val="24"/>
                 <w:szCs w:val="24"/>
               </w:rPr>
-              <w:t>1+</w:t>
-            </w:r>
-            <w:r>
-              <w:rPr>
-                <w:sz w:val="24"/>
-                <w:szCs w:val="24"/>
-              </w:rPr>
-              <w:t>2</w:t>
+              <w:t>1+2</w:t>
             </w:r>
             <w:r>
               <w:rPr>
@@ -2717,35 +2504,7 @@
                 <w:sz w:val="24"/>
                 <w:szCs w:val="24"/>
               </w:rPr>
-              <w:t>(</w:t>
-            </w:r>
-            <w:r>
-              <w:rPr>
-                <w:sz w:val="24"/>
-                <w:szCs w:val="24"/>
-              </w:rPr>
-              <w:t>30</w:t>
-            </w:r>
-            <w:r>
-              <w:rPr>
-                <w:sz w:val="24"/>
-                <w:szCs w:val="24"/>
-              </w:rPr>
-              <w:t xml:space="preserve">+ </w:t>
-            </w:r>
-            <w:r>
-              <w:rPr>
-                <w:sz w:val="24"/>
-                <w:szCs w:val="24"/>
-              </w:rPr>
-              <w:t>2*</w:t>
-            </w:r>
-            <w:r>
-              <w:rPr>
-                <w:sz w:val="24"/>
-                <w:szCs w:val="24"/>
-              </w:rPr>
-              <w:t>Mask temporal frequency)</w:t>
+              <w:t>(30+ 2*Mask temporal frequency)</w:t>
             </w:r>
           </w:p>
         </w:tc>
@@ -2839,14 +2598,7 @@
                 <w:sz w:val="24"/>
                 <w:szCs w:val="24"/>
               </w:rPr>
-              <w:t>1</w:t>
-            </w:r>
-            <w:r>
-              <w:rPr>
-                <w:sz w:val="24"/>
-                <w:szCs w:val="24"/>
-              </w:rPr>
-              <w:t>-2</w:t>
+              <w:t>1-2</w:t>
             </w:r>
             <w:r>
               <w:rPr>
@@ -2893,148 +2645,178 @@
       </w:pPr>
     </w:p>
     <w:p>
-      <w:r>
-        <w:t xml:space="preserve">For 45° separation plaids – data is saved separately in a file named </w:t>
-      </w:r>
-      <w:r>
-        <w:rPr>
-          <w:b/>
-          <w:bCs/>
-        </w:rPr>
-        <w:t>SmallStimPlaid_HighRMSLFP_sessionWise_fortyFive_Microelectrode.mat</w:t>
-      </w:r>
-      <w:r>
-        <w:t xml:space="preserve">. These protocols were run for M2 and M3 only. The file </w:t>
-      </w:r>
-      <w:r>
-        <w:t>is organized similarly</w:t>
-      </w:r>
-      <w:r>
-        <w:t xml:space="preserve"> </w:t>
-      </w:r>
-      <w:r>
-        <w:t>to the one</w:t>
-      </w:r>
-      <w:r>
-        <w:t xml:space="preserve"> described above. Two columns in </w:t>
-      </w:r>
-      <w:r>
-        <w:t xml:space="preserve">the </w:t>
-      </w:r>
-      <w:r>
-        <w:t xml:space="preserve">cell array correspond to M2 and M3. </w:t>
-      </w:r>
-    </w:p>
-    <w:p>
-      <w:r>
-        <w:t xml:space="preserve">Similar </w:t>
-      </w:r>
-      <w:r>
-        <w:t xml:space="preserve">to this, we also saved Spiking data for small sized stimulus – These files are named as </w:t>
-      </w:r>
-      <w:r>
-        <w:rPr>
-          <w:b/>
-          <w:bCs/>
-        </w:rPr>
-        <w:t>SmallStimPlaid_GoodSpikeElecsSpike</w:t>
-      </w:r>
-      <w:r>
-        <w:rPr>
-          <w:b/>
-          <w:bCs/>
-        </w:rPr>
-        <w:t>_sessionWise</w:t>
-      </w:r>
-      <w:r>
-        <w:rPr>
-          <w:b/>
-          <w:bCs/>
-        </w:rPr>
-        <w:t>_Microelectrode.mat</w:t>
-      </w:r>
-      <w:r>
-        <w:t xml:space="preserve"> and</w:t>
-      </w:r>
-      <w:r>
-        <w:t xml:space="preserve"> </w:t>
-      </w:r>
-      <w:r>
-        <w:rPr>
-          <w:b/>
-          <w:bCs/>
-        </w:rPr>
-        <w:t>SmallStimPlaid_GoodSpikeElecsSpike_sessionWise_forty</w:t>
-      </w:r>
-      <w:r>
-        <w:rPr>
-          <w:b/>
-          <w:bCs/>
-        </w:rPr>
-        <w:t>F</w:t>
-      </w:r>
-      <w:r>
-        <w:rPr>
-          <w:b/>
-          <w:bCs/>
-        </w:rPr>
-        <w:t>ive_Microelectrode.mat</w:t>
-      </w:r>
-      <w:r>
-        <w:t>.</w:t>
-      </w:r>
-    </w:p>
-    <w:p>
-      <w:r>
-        <w:t xml:space="preserve">This file was generated using codes - </w:t>
-      </w:r>
-      <w:r>
-        <w:t xml:space="preserve"> </w:t>
-      </w:r>
-      <w:r>
-        <w:t>runGetDualTF_SmallStim_LFPVals_sessionWise.m</w:t>
-      </w:r>
-      <w:r>
-        <w:t xml:space="preserve"> and </w:t>
-      </w:r>
-      <w:r>
-        <w:t>runGetDualTF_SmallStim_LFPVals_sessionWise_fortyFive.m</w:t>
-      </w:r>
-      <w:r>
-        <w:t xml:space="preserve">. </w:t>
-      </w:r>
-      <w:r>
-        <w:t>These codes then use</w:t>
-      </w:r>
-      <w:r>
-        <w:t xml:space="preserve"> </w:t>
-      </w:r>
-      <w:r>
-        <w:t>getDualTF_SmallStim_LFPVals_sessionWise.m</w:t>
-      </w:r>
-      <w:r>
-        <w:t xml:space="preserve">, </w:t>
-      </w:r>
-      <w:r>
-        <w:t>getGoodSpikingElecs_DualTFSmallStim.m</w:t>
-      </w:r>
-      <w:r>
-        <w:t xml:space="preserve"> and </w:t>
-      </w:r>
-      <w:r>
-        <w:t>getGoodSpikingElecs_DualTFSmallStim.m</w:t>
-      </w:r>
-      <w:r>
-        <w:t>. These codes need trial-wise segmented rawData files to run.</w:t>
-      </w:r>
-    </w:p>
-    <w:p>
       <w:pPr>
         <w:pStyle w:val="ListParagraph"/>
         <w:ind w:left="0"/>
         <w:jc w:val="both"/>
       </w:pPr>
       <w:r>
+        <w:t xml:space="preserve">For EEG data </w:t>
+      </w:r>
+      <w:r>
+        <w:t xml:space="preserve">– similar organization is followed. Data is saved separately in a file named </w:t>
+      </w:r>
+      <w:r>
+        <w:rPr>
+          <w:b/>
+          <w:bCs/>
+        </w:rPr>
+        <w:t>FullStimPlaid_sessionWise_EEG</w:t>
+      </w:r>
+      <w:r>
+        <w:rPr>
+          <w:b/>
+          <w:bCs/>
+        </w:rPr>
+        <w:t>.mat</w:t>
+      </w:r>
+      <w:r>
+        <w:t xml:space="preserve">. These were run for parallel and orthogonal sessions for monkey M2 and M4. </w:t>
+      </w:r>
+    </w:p>
+    <w:p>
+      <w:r>
+        <w:t xml:space="preserve">For 45° separation plaids – data is saved separately in a file named </w:t>
+      </w:r>
+      <w:r>
+        <w:rPr>
+          <w:b/>
+          <w:bCs/>
+        </w:rPr>
+        <w:t>SmallStimPlaid_HighRMSLFP_sessionWise_fortyFive_Microelectrode.mat</w:t>
+      </w:r>
+      <w:r>
+        <w:t xml:space="preserve">. These protocols were run for M2 and M3 only. The file </w:t>
+      </w:r>
+      <w:r>
+        <w:t>is organized similarly</w:t>
+      </w:r>
+      <w:r>
+        <w:t xml:space="preserve"> </w:t>
+      </w:r>
+      <w:r>
+        <w:t>to the one</w:t>
+      </w:r>
+      <w:r>
+        <w:t xml:space="preserve"> described above. Two columns in </w:t>
+      </w:r>
+      <w:r>
+        <w:t xml:space="preserve">the </w:t>
+      </w:r>
+      <w:r>
+        <w:t xml:space="preserve">cell array correspond to M2 and M3. </w:t>
+      </w:r>
+    </w:p>
+    <w:p>
+      <w:r>
+        <w:t xml:space="preserve">Similar </w:t>
+      </w:r>
+      <w:r>
+        <w:t xml:space="preserve">to this, we also saved Spiking data for small sized stimulus – These files are named as </w:t>
+      </w:r>
+      <w:r>
+        <w:rPr>
+          <w:b/>
+          <w:bCs/>
+        </w:rPr>
+        <w:t>SmallStimPlaid_GoodSpikeElecsSpike</w:t>
+      </w:r>
+      <w:r>
+        <w:rPr>
+          <w:b/>
+          <w:bCs/>
+        </w:rPr>
+        <w:t>_sessionWise</w:t>
+      </w:r>
+      <w:r>
+        <w:rPr>
+          <w:b/>
+          <w:bCs/>
+        </w:rPr>
+        <w:t>_Microelectrode.mat</w:t>
+      </w:r>
+      <w:r>
+        <w:t xml:space="preserve"> and</w:t>
+      </w:r>
+      <w:r>
+        <w:t xml:space="preserve"> </w:t>
+      </w:r>
+      <w:r>
+        <w:rPr>
+          <w:b/>
+          <w:bCs/>
+        </w:rPr>
+        <w:t>SmallStimPlaid_GoodSpikeElecsSpike_sessionWise_forty</w:t>
+      </w:r>
+      <w:r>
+        <w:rPr>
+          <w:b/>
+          <w:bCs/>
+        </w:rPr>
+        <w:t>F</w:t>
+      </w:r>
+      <w:r>
+        <w:rPr>
+          <w:b/>
+          <w:bCs/>
+        </w:rPr>
+        <w:t>ive_Microelectrode.mat</w:t>
+      </w:r>
+      <w:r>
+        <w:t>.</w:t>
+      </w:r>
+    </w:p>
+    <w:p>
+      <w:r>
+        <w:t xml:space="preserve">This file was generated using codes - </w:t>
+      </w:r>
+      <w:r>
+        <w:t xml:space="preserve"> </w:t>
+      </w:r>
+      <w:r>
+        <w:t>runGetDualTF_SmallStim_LFPVals_sessionWise.m</w:t>
+      </w:r>
+      <w:r>
+        <w:t xml:space="preserve"> and </w:t>
+      </w:r>
+      <w:r>
+        <w:t>runGetDualTF_SmallStim_LFPVals_sessionWise_fortyFive.m</w:t>
+      </w:r>
+      <w:r>
+        <w:t xml:space="preserve">. </w:t>
+      </w:r>
+      <w:r>
+        <w:t>These codes then use</w:t>
+      </w:r>
+      <w:r>
+        <w:t xml:space="preserve"> </w:t>
+      </w:r>
+      <w:r>
+        <w:t>getDualTF_SmallStim_LFPVals_sessionWise.m</w:t>
+      </w:r>
+      <w:r>
+        <w:t xml:space="preserve">, </w:t>
+      </w:r>
+      <w:r>
+        <w:t>getGoodSpikingElecs_DualTFSmallStim.m</w:t>
+      </w:r>
+      <w:r>
+        <w:t xml:space="preserve"> and </w:t>
+      </w:r>
+      <w:r>
+        <w:t>getGoodSpikingElecs_DualTFSmallStim.m</w:t>
+      </w:r>
+      <w:r>
+        <w:t>. These codes need trial-wise segmented rawData files to run.</w:t>
+      </w:r>
+    </w:p>
+    <w:p>
+      <w:pPr>
+        <w:pStyle w:val="ListParagraph"/>
+        <w:ind w:left="0"/>
+        <w:jc w:val="both"/>
+      </w:pPr>
+      <w:r>
         <w:t>Organization of the file</w:t>
       </w:r>
       <w:r>
@@ -3062,16 +2844,7 @@
         <w:t>°</w:t>
       </w:r>
       <w:r>
-        <w:t>)</w:t>
-      </w:r>
-      <w:r>
-        <w:t>,</w:t>
-      </w:r>
-      <w:r>
-        <w:t xml:space="preserve"> and columns correspond to different monkeys (M1, M2</w:t>
-      </w:r>
-      <w:r>
-        <w:t xml:space="preserve"> and o</w:t>
+        <w:t>), and columns correspond to different monkeys (M1, M2 and o</w:t>
       </w:r>
       <w:r>
         <w:t>nly M2 for 45°)</w:t>
@@ -3227,6 +3000,7 @@
                 <w:sz w:val="24"/>
                 <w:szCs w:val="24"/>
               </w:rPr>
+              <w:lastRenderedPageBreak/>
               <w:t xml:space="preserve">Parameters </w:t>
             </w:r>
           </w:p>
@@ -3325,15 +3099,7 @@
                 <w:sz w:val="24"/>
                 <w:szCs w:val="24"/>
               </w:rPr>
-              <w:t xml:space="preserve">It corresponds to the change in firing rate (Stimulus-Baseline </w:t>
-            </w:r>
-            <w:r>
-              <w:rPr>
-                <w:sz w:val="24"/>
-                <w:szCs w:val="24"/>
-              </w:rPr>
-              <w:lastRenderedPageBreak/>
-              <w:t xml:space="preserve">period). </w:t>
+              <w:t xml:space="preserve">It corresponds to the change in firing rate (Stimulus-Baseline period). </w:t>
             </w:r>
             <w:r>
               <w:rPr>
@@ -3401,7 +3167,6 @@
                 <w:sz w:val="24"/>
                 <w:szCs w:val="24"/>
               </w:rPr>
-              <w:lastRenderedPageBreak/>
               <w:t>psthVals_grating</w:t>
             </w:r>
           </w:p>
@@ -3426,21 +3191,7 @@
                 <w:sz w:val="24"/>
                 <w:szCs w:val="24"/>
               </w:rPr>
-              <w:t xml:space="preserve">5D array - </w:t>
-            </w:r>
-            <w:r>
-              <w:rPr>
-                <w:sz w:val="24"/>
-                <w:szCs w:val="24"/>
-              </w:rPr>
-              <w:t>Electrodes*Target Grating Contrast (at 0%)* Mask Grating Contrast*Mask Temporal Frequency</w:t>
-            </w:r>
-            <w:r>
-              <w:rPr>
-                <w:sz w:val="24"/>
-                <w:szCs w:val="24"/>
-              </w:rPr>
-              <w:t xml:space="preserve"> * </w:t>
+              <w:t xml:space="preserve">5D array - Electrodes*Target Grating Contrast (at 0%)* Mask Grating Contrast*Mask Temporal Frequency * </w:t>
             </w:r>
             <w:r>
               <w:rPr>
@@ -3673,21 +3424,7 @@
                 <w:sz w:val="24"/>
                 <w:szCs w:val="24"/>
               </w:rPr>
-              <w:t>5D array - Electrodes*Target Grating Contrast (at 0%)* Mask Grating Contrast*Mask Temporal Frequency * Values (</w:t>
-            </w:r>
-            <w:r>
-              <w:rPr>
-                <w:sz w:val="24"/>
-                <w:szCs w:val="24"/>
-              </w:rPr>
-              <w:t>Frequency values</w:t>
-            </w:r>
-            <w:r>
-              <w:rPr>
-                <w:sz w:val="24"/>
-                <w:szCs w:val="24"/>
-              </w:rPr>
-              <w:t xml:space="preserve"> saved in Parameters structure)</w:t>
+              <w:t>5D array - Electrodes*Target Grating Contrast (at 0%)* Mask Grating Contrast*Mask Temporal Frequency * Values (Frequency values saved in Parameters structure)</w:t>
             </w:r>
           </w:p>
         </w:tc>
@@ -3751,35 +3488,14 @@
                 <w:sz w:val="24"/>
                 <w:szCs w:val="24"/>
               </w:rPr>
-              <w:t xml:space="preserve">FFT for PSTH during the </w:t>
-            </w:r>
-            <w:r>
-              <w:rPr>
-                <w:sz w:val="24"/>
-                <w:szCs w:val="24"/>
-              </w:rPr>
-              <w:t>baseline</w:t>
-            </w:r>
-            <w:r>
-              <w:rPr>
-                <w:sz w:val="24"/>
-                <w:szCs w:val="24"/>
-              </w:rPr>
-              <w:t xml:space="preserve"> period.</w:t>
-            </w:r>
-            <w:r>
-              <w:rPr>
-                <w:sz w:val="24"/>
-                <w:szCs w:val="24"/>
-              </w:rPr>
-              <w:t xml:space="preserve"> </w:t>
-            </w:r>
-            <w:r>
-              <w:rPr>
-                <w:sz w:val="24"/>
-                <w:szCs w:val="24"/>
-              </w:rPr>
-              <w:t>5D array - Electrodes*Target Grating Contrast (at 0%)* Mask Grating Contrast*Mask Temporal Frequency * Values (Frequency values saved in Parameters structure)</w:t>
+              <w:t>FFT for PSTH during the baseline period.</w:t>
+            </w:r>
+            <w:r>
+              <w:rPr>
+                <w:sz w:val="24"/>
+                <w:szCs w:val="24"/>
+              </w:rPr>
+              <w:t xml:space="preserve"> 5D array - Electrodes*Target Grating Contrast (at 0%)* Mask Grating Contrast*Mask Temporal Frequency * Values (Frequency values saved in Parameters structure)</w:t>
             </w:r>
           </w:p>
         </w:tc>
@@ -3919,35 +3635,14 @@
                 <w:sz w:val="24"/>
                 <w:szCs w:val="24"/>
               </w:rPr>
-              <w:t xml:space="preserve"> </w:t>
-            </w:r>
-            <w:r>
-              <w:rPr>
-                <w:sz w:val="24"/>
-                <w:szCs w:val="24"/>
-              </w:rPr>
-              <w:t>* Mask Grating Contrast</w:t>
-            </w:r>
-            <w:r>
-              <w:rPr>
-                <w:sz w:val="24"/>
-                <w:szCs w:val="24"/>
-              </w:rPr>
-              <w:t xml:space="preserve"> </w:t>
-            </w:r>
-            <w:r>
-              <w:rPr>
-                <w:sz w:val="24"/>
-                <w:szCs w:val="24"/>
-              </w:rPr>
-              <w:t>(0 to 25% on a log scale)</w:t>
-            </w:r>
-            <w:r>
-              <w:rPr>
-                <w:sz w:val="24"/>
-                <w:szCs w:val="24"/>
-              </w:rPr>
-              <w:t xml:space="preserve"> </w:t>
+              <w:t xml:space="preserve"> * Mask Grating Contrast</w:t>
+            </w:r>
+            <w:r>
+              <w:rPr>
+                <w:sz w:val="24"/>
+                <w:szCs w:val="24"/>
+              </w:rPr>
+              <w:t xml:space="preserve"> (0 to 25% on a log scale) </w:t>
             </w:r>
             <w:r>
               <w:rPr>
@@ -4208,21 +3903,7 @@
                 <w:sz w:val="24"/>
                 <w:szCs w:val="24"/>
               </w:rPr>
-              <w:t>Target Grating Contrast</w:t>
-            </w:r>
-            <w:r>
-              <w:rPr>
-                <w:sz w:val="24"/>
-                <w:szCs w:val="24"/>
-              </w:rPr>
-              <w:t xml:space="preserve"> </w:t>
-            </w:r>
-            <w:r>
-              <w:rPr>
-                <w:sz w:val="24"/>
-                <w:szCs w:val="24"/>
-              </w:rPr>
-              <w:t>* Mask Grating Contrast</w:t>
+              <w:t>Target Grating Contrast * Mask Grating Contrast</w:t>
             </w:r>
             <w:r>
               <w:rPr>
@@ -4300,21 +3981,7 @@
                 <w:sz w:val="24"/>
                 <w:szCs w:val="24"/>
               </w:rPr>
-              <w:t xml:space="preserve">FFT for PSTH during the </w:t>
-            </w:r>
-            <w:r>
-              <w:rPr>
-                <w:sz w:val="24"/>
-                <w:szCs w:val="24"/>
-              </w:rPr>
-              <w:t>baseline</w:t>
-            </w:r>
-            <w:r>
-              <w:rPr>
-                <w:sz w:val="24"/>
-                <w:szCs w:val="24"/>
-              </w:rPr>
-              <w:t xml:space="preserve"> period. 5D array </w:t>
+              <w:t xml:space="preserve">FFT for PSTH during the baseline period. 5D array </w:t>
             </w:r>
             <w:r>
               <w:rPr>
@@ -4397,21 +4064,7 @@
                 <w:sz w:val="24"/>
                 <w:szCs w:val="24"/>
               </w:rPr>
-              <w:t xml:space="preserve">Change in amplitude at the </w:t>
-            </w:r>
-            <w:r>
-              <w:rPr>
-                <w:sz w:val="24"/>
-                <w:szCs w:val="24"/>
-              </w:rPr>
-              <w:t>30Hz</w:t>
-            </w:r>
-            <w:r>
-              <w:rPr>
-                <w:sz w:val="24"/>
-                <w:szCs w:val="24"/>
-              </w:rPr>
-              <w:t>. 4D array – Electrodes*Target Grating Contrast*Mask Grating Contrast*Mask Temporal Frequency</w:t>
+              <w:t>Change in amplitude at the 30Hz. 4D array – Electrodes*Target Grating Contrast*Mask Grating Contrast*Mask Temporal Frequency</w:t>
             </w:r>
           </w:p>
         </w:tc>
@@ -4498,7 +4151,15 @@
                 <w:sz w:val="24"/>
                 <w:szCs w:val="24"/>
               </w:rPr>
-              <w:t xml:space="preserve"> subtracted from grating condition</w:t>
+              <w:t xml:space="preserve"> subtracted </w:t>
+            </w:r>
+            <w:r>
+              <w:rPr>
+                <w:sz w:val="24"/>
+                <w:szCs w:val="24"/>
+              </w:rPr>
+              <w:lastRenderedPageBreak/>
+              <w:t>from grating condition</w:t>
             </w:r>
             <w:r>
               <w:rPr>
@@ -4648,14 +4309,7 @@
           <w:b/>
           <w:bCs/>
         </w:rPr>
-        <w:t xml:space="preserve">Experiment </w:t>
-      </w:r>
-      <w:r>
-        <w:rPr>
-          <w:b/>
-          <w:bCs/>
-        </w:rPr>
-        <w:t xml:space="preserve">3 </w:t>
+        <w:t xml:space="preserve">Experiment 3 </w:t>
       </w:r>
       <w:r>
         <w:t xml:space="preserve">involved presentation of gratings at varying contrasts and temporal frequencies. </w:t>
@@ -4681,21 +4335,7 @@
           <w:b/>
           <w:bCs/>
         </w:rPr>
-        <w:t>M</w:t>
-      </w:r>
-      <w:r>
-        <w:rPr>
-          <w:b/>
-          <w:bCs/>
-        </w:rPr>
-        <w:t>2</w:t>
-      </w:r>
-      <w:r>
-        <w:rPr>
-          <w:b/>
-          <w:bCs/>
-        </w:rPr>
-        <w:t>_ConTF_GoodSpikingLFP_sessionWise_Microelectrode.mat</w:t>
+        <w:t>M2_ConTF_GoodSpikingLFP_sessionWise_Microelectrode.mat</w:t>
       </w:r>
       <w:r>
         <w:rPr>
@@ -5284,13 +4924,7 @@
         <w:jc w:val="both"/>
       </w:pPr>
       <w:r>
-        <w:t xml:space="preserve">Figure 2 </w:t>
-      </w:r>
-      <w:r>
-        <w:t>–</w:t>
-      </w:r>
-      <w:r>
-        <w:t xml:space="preserve"> </w:t>
+        <w:t xml:space="preserve">Figure 2 – </w:t>
       </w:r>
     </w:p>
     <w:p>
@@ -5368,14 +5002,7 @@
           <w:b/>
           <w:bCs/>
         </w:rPr>
-        <w:t>Figure2Data_sessionWise</w:t>
-      </w:r>
-      <w:r>
-        <w:rPr>
-          <w:b/>
-          <w:bCs/>
-        </w:rPr>
-        <w:t>.mat</w:t>
+        <w:t>Figure2Data_sessionWise.mat</w:t>
       </w:r>
       <w:r>
         <w:t>)</w:t>
@@ -5475,10 +5102,7 @@
         <w:jc w:val="both"/>
       </w:pPr>
       <w:r>
-        <w:t xml:space="preserve">Figure 3 </w:t>
-      </w:r>
-      <w:r>
-        <w:t xml:space="preserve">– </w:t>
+        <w:t xml:space="preserve">Figure 3 – </w:t>
       </w:r>
     </w:p>
     <w:p>
@@ -5508,6 +5132,13 @@
           <w:bCs/>
         </w:rPr>
         <w:t>SmallStimPlaid</w:t>
+      </w:r>
+      <w:r>
+        <w:rPr>
+          <w:b/>
+          <w:bCs/>
+        </w:rPr>
+        <w:t xml:space="preserve"> and EEG</w:t>
       </w:r>
       <w:r>
         <w:rPr>
@@ -5535,20 +5166,13 @@
           <w:b/>
           <w:bCs/>
         </w:rPr>
-        <w:t>runGetDataForFigure3AndPlot_sessionWise.m</w:t>
-      </w:r>
-      <w:r>
-        <w:rPr>
-          <w:b/>
-          <w:bCs/>
-        </w:rPr>
-        <w:t xml:space="preserve"> </w:t>
+        <w:t xml:space="preserve">runGetDataForFigure3AndPlot_sessionWise.m </w:t>
       </w:r>
       <w:r>
         <w:t xml:space="preserve">uses </w:t>
       </w:r>
       <w:r>
-        <w:t>three</w:t>
+        <w:t>four</w:t>
       </w:r>
       <w:r>
         <w:t xml:space="preserve"> codes called</w:t>
@@ -5632,17 +5256,15 @@
           <w:kern w:val="0"/>
           <w:lang w:val="en-IN"/>
         </w:rPr>
-        <w:t>getDataForFigure_Spiking</w:t>
-      </w:r>
-      <w:r>
-        <w:rPr>
-          <w:b/>
-          <w:bCs/>
+        <w:t>getDataForFigure_Spiking.m</w:t>
+      </w:r>
+      <w:r>
+        <w:rPr>
           <w:color w:val="000000"/>
           <w:kern w:val="0"/>
           <w:lang w:val="en-IN"/>
         </w:rPr>
-        <w:t>.m</w:t>
+        <w:t xml:space="preserve"> (for saving spiking data)</w:t>
       </w:r>
       <w:r>
         <w:rPr>
@@ -5650,7 +5272,7 @@
           <w:kern w:val="0"/>
           <w:lang w:val="en-IN"/>
         </w:rPr>
-        <w:t xml:space="preserve"> (for saving spiking data) and </w:t>
+        <w:t xml:space="preserve">, </w:t>
       </w:r>
       <w:r>
         <w:rPr>
@@ -5660,7 +5282,7 @@
           <w:kern w:val="0"/>
           <w:lang w:val="en-IN"/>
         </w:rPr>
-        <w:t>plotFigure</w:t>
+        <w:t>getDataForChangeinAmp_EEG</w:t>
       </w:r>
       <w:r>
         <w:rPr>
@@ -5670,7 +5292,7 @@
           <w:kern w:val="0"/>
           <w:lang w:val="en-IN"/>
         </w:rPr>
-        <w:t>3_sessionWise.m</w:t>
+        <w:t>.m</w:t>
       </w:r>
       <w:r>
         <w:rPr>
@@ -5678,7 +5300,7 @@
           <w:kern w:val="0"/>
           <w:lang w:val="en-IN"/>
         </w:rPr>
-        <w:t>. The main code searches for saved files for generating Figure 3</w:t>
+        <w:t xml:space="preserve"> (for saving EEG data)</w:t>
       </w:r>
       <w:r>
         <w:rPr>
@@ -5686,17 +5308,15 @@
           <w:kern w:val="0"/>
           <w:lang w:val="en-IN"/>
         </w:rPr>
-        <w:t xml:space="preserve"> (</w:t>
-      </w:r>
-      <w:r>
-        <w:rPr>
-          <w:b/>
-          <w:bCs/>
+        <w:t xml:space="preserve"> </w:t>
+      </w:r>
+      <w:r>
+        <w:rPr>
           <w:color w:val="000000"/>
           <w:kern w:val="0"/>
           <w:lang w:val="en-IN"/>
         </w:rPr>
-        <w:t>Figure3_LFPData</w:t>
+        <w:t xml:space="preserve">and </w:t>
       </w:r>
       <w:r>
         <w:rPr>
@@ -5706,7 +5326,7 @@
           <w:kern w:val="0"/>
           <w:lang w:val="en-IN"/>
         </w:rPr>
-        <w:t>_</w:t>
+        <w:t>plotFigure</w:t>
       </w:r>
       <w:r>
         <w:rPr>
@@ -5716,17 +5336,15 @@
           <w:kern w:val="0"/>
           <w:lang w:val="en-IN"/>
         </w:rPr>
-        <w:t>sessionWise</w:t>
-      </w:r>
-      <w:r>
-        <w:rPr>
-          <w:b/>
-          <w:bCs/>
+        <w:t>3_sessionWise.m</w:t>
+      </w:r>
+      <w:r>
+        <w:rPr>
           <w:color w:val="000000"/>
           <w:kern w:val="0"/>
           <w:lang w:val="en-IN"/>
         </w:rPr>
-        <w:t>.mat</w:t>
+        <w:t>. The main code searches for saved files for generating Figure 3</w:t>
       </w:r>
       <w:r>
         <w:rPr>
@@ -5734,7 +5352,7 @@
           <w:kern w:val="0"/>
           <w:lang w:val="en-IN"/>
         </w:rPr>
-        <w:t xml:space="preserve"> and </w:t>
+        <w:t xml:space="preserve"> (</w:t>
       </w:r>
       <w:r>
         <w:rPr>
@@ -5744,7 +5362,7 @@
           <w:kern w:val="0"/>
           <w:lang w:val="en-IN"/>
         </w:rPr>
-        <w:t>Figure3</w:t>
+        <w:t>Figure3_LFPData</w:t>
       </w:r>
       <w:r>
         <w:rPr>
@@ -5764,7 +5382,7 @@
           <w:kern w:val="0"/>
           <w:lang w:val="en-IN"/>
         </w:rPr>
-        <w:t>SpikingData</w:t>
+        <w:t>sessionWise</w:t>
       </w:r>
       <w:r>
         <w:rPr>
@@ -5782,46 +5400,184 @@
           <w:kern w:val="0"/>
           <w:lang w:val="en-IN"/>
         </w:rPr>
-        <w:t>)</w:t>
-      </w:r>
-      <w:r>
-        <w:rPr>
+        <w:t xml:space="preserve">, </w:t>
+      </w:r>
+      <w:r>
+        <w:rPr>
+          <w:b/>
+          <w:bCs/>
           <w:color w:val="000000"/>
           <w:kern w:val="0"/>
           <w:lang w:val="en-IN"/>
         </w:rPr>
-        <w:t>. If that does not exist in the path, it generates Figure 3 file</w:t>
-      </w:r>
-      <w:r>
-        <w:rPr>
+        <w:t>Figure3</w:t>
+      </w:r>
+      <w:r>
+        <w:rPr>
+          <w:b/>
+          <w:bCs/>
           <w:color w:val="000000"/>
           <w:kern w:val="0"/>
           <w:lang w:val="en-IN"/>
         </w:rPr>
-        <w:t>s</w:t>
-      </w:r>
-      <w:r>
-        <w:rPr>
+        <w:t>_</w:t>
+      </w:r>
+      <w:r>
+        <w:rPr>
+          <w:b/>
+          <w:bCs/>
           <w:color w:val="000000"/>
           <w:kern w:val="0"/>
           <w:lang w:val="en-IN"/>
         </w:rPr>
-        <w:t xml:space="preserve"> and </w:t>
-      </w:r>
-      <w:r>
-        <w:rPr>
+        <w:t>SpikingData</w:t>
+      </w:r>
+      <w:r>
+        <w:rPr>
+          <w:b/>
+          <w:bCs/>
           <w:color w:val="000000"/>
           <w:kern w:val="0"/>
           <w:lang w:val="en-IN"/>
         </w:rPr>
-        <w:t>plots them</w:t>
-      </w:r>
-      <w:r>
-        <w:rPr>
+        <w:t>.mat</w:t>
+      </w:r>
+      <w:r>
+        <w:rPr>
+          <w:b/>
+          <w:bCs/>
           <w:color w:val="000000"/>
           <w:kern w:val="0"/>
           <w:lang w:val="en-IN"/>
         </w:rPr>
+        <w:t xml:space="preserve"> and </w:t>
+      </w:r>
+      <w:r>
+        <w:rPr>
+          <w:b/>
+          <w:bCs/>
+          <w:color w:val="000000"/>
+          <w:kern w:val="0"/>
+          <w:lang w:val="en-IN"/>
+        </w:rPr>
+        <w:t>Figure3</w:t>
+      </w:r>
+      <w:r>
+        <w:rPr>
+          <w:b/>
+          <w:bCs/>
+          <w:color w:val="000000"/>
+          <w:kern w:val="0"/>
+          <w:lang w:val="en-IN"/>
+        </w:rPr>
+        <w:t>_</w:t>
+      </w:r>
+      <w:r>
+        <w:rPr>
+          <w:b/>
+          <w:bCs/>
+          <w:color w:val="000000"/>
+          <w:kern w:val="0"/>
+          <w:lang w:val="en-IN"/>
+        </w:rPr>
+        <w:t xml:space="preserve"> </w:t>
+      </w:r>
+      <w:r>
+        <w:rPr>
+          <w:b/>
+          <w:bCs/>
+          <w:color w:val="000000"/>
+          <w:kern w:val="0"/>
+          <w:lang w:val="en-IN"/>
+        </w:rPr>
+        <w:t>EEG</w:t>
+      </w:r>
+      <w:r>
+        <w:rPr>
+          <w:b/>
+          <w:bCs/>
+          <w:color w:val="000000"/>
+          <w:kern w:val="0"/>
+          <w:lang w:val="en-IN"/>
+        </w:rPr>
+        <w:t>Data</w:t>
+      </w:r>
+      <w:r>
+        <w:rPr>
+          <w:b/>
+          <w:bCs/>
+          <w:color w:val="000000"/>
+          <w:kern w:val="0"/>
+          <w:lang w:val="en-IN"/>
+        </w:rPr>
+        <w:t>_</w:t>
+      </w:r>
+      <w:r>
+        <w:rPr>
+          <w:b/>
+          <w:bCs/>
+          <w:color w:val="000000"/>
+          <w:kern w:val="0"/>
+          <w:lang w:val="en-IN"/>
+        </w:rPr>
+        <w:t>sessionWise</w:t>
+      </w:r>
+      <w:r>
+        <w:rPr>
+          <w:b/>
+          <w:bCs/>
+          <w:color w:val="000000"/>
+          <w:kern w:val="0"/>
+          <w:lang w:val="en-IN"/>
+        </w:rPr>
+        <w:t>.mat</w:t>
+      </w:r>
+      <w:r>
+        <w:rPr>
+          <w:color w:val="000000"/>
+          <w:kern w:val="0"/>
+          <w:lang w:val="en-IN"/>
+        </w:rPr>
+        <w:t>)</w:t>
+      </w:r>
+      <w:r>
+        <w:rPr>
+          <w:color w:val="000000"/>
+          <w:kern w:val="0"/>
+          <w:lang w:val="en-IN"/>
+        </w:rPr>
+        <w:t>. If that does not exist in the path, it generates Figure 3 file</w:t>
+      </w:r>
+      <w:r>
+        <w:rPr>
+          <w:color w:val="000000"/>
+          <w:kern w:val="0"/>
+          <w:lang w:val="en-IN"/>
+        </w:rPr>
+        <w:t>s</w:t>
+      </w:r>
+      <w:r>
+        <w:rPr>
+          <w:color w:val="000000"/>
+          <w:kern w:val="0"/>
+          <w:lang w:val="en-IN"/>
+        </w:rPr>
+        <w:t xml:space="preserve"> and </w:t>
+      </w:r>
+      <w:r>
+        <w:rPr>
+          <w:color w:val="000000"/>
+          <w:kern w:val="0"/>
+          <w:lang w:val="en-IN"/>
+        </w:rPr>
+        <w:t>plots them</w:t>
+      </w:r>
+      <w:r>
+        <w:rPr>
+          <w:color w:val="000000"/>
+          <w:kern w:val="0"/>
+          <w:lang w:val="en-IN"/>
+        </w:rPr>
         <w:t xml:space="preserve">. </w:t>
       </w:r>
     </w:p>
@@ -5849,13 +5605,7 @@
         <w:jc w:val="both"/>
       </w:pPr>
       <w:r>
-        <w:t xml:space="preserve">Figure </w:t>
-      </w:r>
-      <w:r>
-        <w:t>4</w:t>
-      </w:r>
-      <w:r>
-        <w:t xml:space="preserve"> </w:t>
+        <w:t xml:space="preserve">Figure 4 </w:t>
       </w:r>
       <w:r>
         <w:t>and Figure 6</w:t>
@@ -5890,14 +5640,7 @@
           <w:b/>
           <w:bCs/>
         </w:rPr>
-        <w:t>Model</w:t>
-      </w:r>
-      <w:r>
-        <w:rPr>
-          <w:b/>
-          <w:bCs/>
-        </w:rPr>
-        <w:t>.</w:t>
+        <w:t>Model.</w:t>
       </w:r>
     </w:p>
     <w:p>
@@ -5979,15 +5722,8 @@
           <w:bCs/>
           <w:lang w:val="en-IN"/>
         </w:rPr>
-        <w:t>getResponsefit</w:t>
-      </w:r>
-      <w:r>
-        <w:rPr>
-          <w:b/>
-          <w:bCs/>
-          <w:lang w:val="en-IN"/>
-        </w:rPr>
-        <w:t>.m</w:t>
+        <w:lastRenderedPageBreak/>
+        <w:t>getResponsefit.m</w:t>
       </w:r>
       <w:r>
         <w:rPr>
@@ -6001,7 +5737,6 @@
         <w:ind w:left="709"/>
       </w:pPr>
       <w:r>
-        <w:lastRenderedPageBreak/>
         <w:t>runGetResponsefit.m</w:t>
       </w:r>
       <w:r>
@@ -6062,14 +5797,7 @@
           <w:b/>
           <w:bCs/>
         </w:rPr>
-        <w:t>Model_LFPData_for_all_elecs_alldelta_allSession_Tuned_Normalization_Model</w:t>
-      </w:r>
-      <w:r>
-        <w:rPr>
-          <w:b/>
-          <w:bCs/>
-        </w:rPr>
-        <w:t>.mat</w:t>
+        <w:t>Model_LFPData_for_all_elecs_alldelta_allSession_Tuned_Normalization_Model.mat</w:t>
       </w:r>
       <w:r>
         <w:t xml:space="preserve"> and </w:t>
@@ -6079,14 +5807,7 @@
           <w:b/>
           <w:bCs/>
         </w:rPr>
-        <w:t>Model_LFPData_for_all_elecs_alldelta_allSession_Optimal_Model</w:t>
-      </w:r>
-      <w:r>
-        <w:rPr>
-          <w:b/>
-          <w:bCs/>
-        </w:rPr>
-        <w:t>.mat</w:t>
+        <w:t>Model_LFPData_for_all_elecs_alldelta_allSession_Optimal_Model.mat</w:t>
       </w:r>
       <w:r>
         <w:t>)</w:t>
@@ -6106,15 +5827,7 @@
           <w:bCs/>
           <w:lang w:val="en-IN"/>
         </w:rPr>
-        <w:t>getAveragedModelData_AllMonkeys</w:t>
-      </w:r>
-      <w:r>
-        <w:rPr>
-          <w:b/>
-          <w:bCs/>
-          <w:lang w:val="en-IN"/>
-        </w:rPr>
-        <w:t>.m</w:t>
+        <w:t>getAveragedModelData_AllMonkeys.m</w:t>
       </w:r>
       <w:r>
         <w:rPr>
@@ -6126,13 +5839,7 @@
         <w:rPr>
           <w:lang w:val="en-IN"/>
         </w:rPr>
-        <w:t xml:space="preserve"> (w</w:t>
-      </w:r>
-      <w:r>
-        <w:rPr>
-          <w:lang w:val="en-IN"/>
-        </w:rPr>
-        <w:t xml:space="preserve">hich is saved in files called </w:t>
+        <w:t xml:space="preserve"> (which is saved in files called </w:t>
       </w:r>
       <w:r>
         <w:rPr>
@@ -6231,13 +5938,7 @@
         <w:jc w:val="both"/>
       </w:pPr>
       <w:r>
-        <w:t xml:space="preserve">Figure </w:t>
-      </w:r>
-      <w:r>
-        <w:t>5</w:t>
-      </w:r>
-      <w:r>
-        <w:t xml:space="preserve"> – </w:t>
+        <w:t xml:space="preserve">Figure 5 – </w:t>
       </w:r>
     </w:p>
     <w:p>
@@ -6303,13 +6004,7 @@
         <w:jc w:val="both"/>
       </w:pPr>
       <w:r>
-        <w:t xml:space="preserve">Figure </w:t>
-      </w:r>
-      <w:r>
-        <w:t>7</w:t>
-      </w:r>
-      <w:r>
-        <w:t xml:space="preserve"> – </w:t>
+        <w:t xml:space="preserve">Figure 7 – </w:t>
       </w:r>
     </w:p>
     <w:p>
@@ -6432,13 +6127,7 @@
         <w:jc w:val="both"/>
       </w:pPr>
       <w:r>
-        <w:t xml:space="preserve">Figure </w:t>
-      </w:r>
-      <w:r>
-        <w:t>8</w:t>
-      </w:r>
-      <w:r>
-        <w:t xml:space="preserve"> – </w:t>
+        <w:t xml:space="preserve">Figure 8 – </w:t>
       </w:r>
     </w:p>
     <w:p>
@@ -6458,14 +6147,7 @@
           <w:b/>
           <w:bCs/>
         </w:rPr>
-        <w:t>ConTF</w:t>
-      </w:r>
-      <w:r>
-        <w:rPr>
-          <w:b/>
-          <w:bCs/>
-        </w:rPr>
-        <w:t>.</w:t>
+        <w:t>ConTF.</w:t>
       </w:r>
     </w:p>
     <w:p>
@@ -6605,14 +6287,7 @@
         <w:jc w:val="both"/>
       </w:pPr>
       <w:r>
-        <w:lastRenderedPageBreak/>
-        <w:t>Figure S</w:t>
-      </w:r>
-      <w:r>
-        <w:t>1</w:t>
-      </w:r>
-      <w:r>
-        <w:t xml:space="preserve"> –</w:t>
+        <w:t>Figure S1 –</w:t>
       </w:r>
     </w:p>
     <w:p>
@@ -6688,10 +6363,7 @@
         <w:jc w:val="both"/>
       </w:pPr>
       <w:r>
-        <w:t>Figure S2</w:t>
-      </w:r>
-      <w:r>
-        <w:t xml:space="preserve"> – </w:t>
+        <w:t xml:space="preserve">Figure S2 – </w:t>
       </w:r>
     </w:p>
     <w:p>
@@ -6792,15 +6464,7 @@
           <w:bCs/>
           <w:lang w:val="en-IN"/>
         </w:rPr>
-        <w:t>getDataForFigure3_sessionWise</w:t>
-      </w:r>
-      <w:r>
-        <w:rPr>
-          <w:b/>
-          <w:bCs/>
-          <w:lang w:val="en-IN"/>
-        </w:rPr>
-        <w:t>.m</w:t>
+        <w:t>getDataForFigure3_sessionWise.m</w:t>
       </w:r>
       <w:r>
         <w:rPr>
@@ -6962,13 +6626,7 @@
         <w:rPr>
           <w:lang w:val="en-IN"/>
         </w:rPr>
-        <w:t xml:space="preserve"> code to find electrodes </w:t>
-      </w:r>
-      <w:r>
-        <w:rPr>
-          <w:lang w:val="en-IN"/>
-        </w:rPr>
-        <w:t xml:space="preserve">which had </w:t>
+        <w:t xml:space="preserve"> code to find electrodes which had </w:t>
       </w:r>
       <w:r>
         <w:rPr>
@@ -7042,15 +6700,7 @@
           <w:bCs/>
           <w:lang w:val="en-IN"/>
         </w:rPr>
-        <w:t>_</w:t>
-      </w:r>
-      <w:r>
-        <w:rPr>
-          <w:b/>
-          <w:bCs/>
-          <w:lang w:val="en-IN"/>
-        </w:rPr>
-        <w:t>FortyFivedelta</w:t>
+        <w:t>_FortyFivedelta</w:t>
       </w:r>
       <w:r>
         <w:rPr>
@@ -7148,13 +6798,7 @@
         <w:jc w:val="both"/>
       </w:pPr>
       <w:r>
-        <w:t xml:space="preserve">Figure </w:t>
-      </w:r>
-      <w:r>
-        <w:t>S3</w:t>
-      </w:r>
-      <w:r>
-        <w:t xml:space="preserve"> – </w:t>
+        <w:t xml:space="preserve">Figure S3 – </w:t>
       </w:r>
     </w:p>
     <w:p>
@@ -7193,21 +6837,7 @@
           <w:b/>
           <w:bCs/>
         </w:rPr>
-        <w:t>ModelSimulatedPlots</w:t>
-      </w:r>
-      <w:r>
-        <w:rPr>
-          <w:b/>
-          <w:bCs/>
-        </w:rPr>
-        <w:t>_ExponentVariant</w:t>
-      </w:r>
-      <w:r>
-        <w:rPr>
-          <w:b/>
-          <w:bCs/>
-        </w:rPr>
-        <w:t>.m</w:t>
+        <w:t>ModelSimulatedPlots_ExponentVariant.m</w:t>
       </w:r>
       <w:r>
         <w:t xml:space="preserve"> – It simulates the summation of sinusoids </w:t>
@@ -7244,10 +6874,7 @@
       </w:pPr>
       <w:r>
         <w:lastRenderedPageBreak/>
-        <w:t xml:space="preserve">Figure </w:t>
-      </w:r>
-      <w:r>
-        <w:t>S4</w:t>
+        <w:t>Figure S4</w:t>
       </w:r>
       <w:r>
         <w:t xml:space="preserve"> and S5</w:t>
@@ -7430,25 +7057,7 @@
           <w:rPr>
             <w:lang w:val="en-IN"/>
           </w:rPr>
-          <w:t>_45</w:t>
-        </w:r>
-        <w:r>
-          <w:rPr>
-            <w:lang w:val="en-IN"/>
-          </w:rPr>
-          <w:t>.m (for S</w:t>
-        </w:r>
-        <w:r>
-          <w:rPr>
-            <w:lang w:val="en-IN"/>
-          </w:rPr>
-          <w:t>5</w:t>
-        </w:r>
-        <w:r>
-          <w:rPr>
-            <w:lang w:val="en-IN"/>
-          </w:rPr>
-          <w:t>)</w:t>
+          <w:t>_45.m (for S5)</w:t>
         </w:r>
       </w:ins>
     </w:p>
@@ -8585,6 +8194,7 @@
   <w:style w:type="character" w:default="1" w:styleId="DefaultParagraphFont">
     <w:name w:val="Default Paragraph Font"/>
     <w:uiPriority w:val="1"/>
+    <w:semiHidden/>
     <w:unhideWhenUsed/>
   </w:style>
   <w:style w:type="table" w:default="1" w:styleId="TableNormal">

</xml_diff>